<commit_message>
add pptx file and fix doc typo
</commit_message>
<xml_diff>
--- a/PRTCP.docx
+++ b/PRTCP.docx
@@ -145,7 +145,7 @@
     <w:p>
       <w:pPr>
         <w:rPr>
-          <w:rFonts w:ascii="TH Sarabun New" w:hAnsi="TH Sarabun New" w:cs="TH Sarabun New" w:hint="cs"/>
+          <w:rFonts w:ascii="TH Sarabun New" w:hAnsi="TH Sarabun New" w:cs="TH Sarabun New"/>
           <w:sz w:val="44"/>
           <w:szCs w:val="44"/>
         </w:rPr>
@@ -1804,7 +1804,7 @@
       <w:pPr>
         <w:ind w:left="720"/>
         <w:rPr>
-          <w:rFonts w:ascii="TH Sarabun New" w:hAnsi="TH Sarabun New" w:cs="TH Sarabun New" w:hint="cs"/>
+          <w:rFonts w:ascii="TH Sarabun New" w:hAnsi="TH Sarabun New" w:cs="TH Sarabun New"/>
           <w:sz w:val="48"/>
           <w:szCs w:val="48"/>
           <w:cs/>
@@ -2382,7 +2382,24 @@
           <w:szCs w:val="48"/>
           <w:cs/>
         </w:rPr>
-        <w:t xml:space="preserve">โดยจะก่อให้เกิด 7 </w:t>
+        <w:t xml:space="preserve">โดยจะก่อให้เกิด </w:t>
+      </w:r>
+      <w:r>
+        <w:rPr>
+          <w:rFonts w:ascii="TH Sarabun New" w:hAnsi="TH Sarabun New" w:cs="TH Sarabun New"/>
+          <w:sz w:val="48"/>
+          <w:szCs w:val="48"/>
+        </w:rPr>
+        <w:t>6</w:t>
+      </w:r>
+      <w:r>
+        <w:rPr>
+          <w:rFonts w:ascii="TH Sarabun New" w:hAnsi="TH Sarabun New" w:cs="TH Sarabun New" w:hint="cs"/>
+          <w:sz w:val="48"/>
+          <w:szCs w:val="48"/>
+          <w:cs/>
+        </w:rPr>
+        <w:t xml:space="preserve"> </w:t>
       </w:r>
       <w:r>
         <w:rPr>
@@ -2921,7 +2938,7 @@
       <w:pPr>
         <w:ind w:left="720"/>
         <w:rPr>
-          <w:rFonts w:ascii="TH Sarabun New" w:hAnsi="TH Sarabun New" w:cs="TH Sarabun New" w:hint="cs"/>
+          <w:rFonts w:ascii="TH Sarabun New" w:hAnsi="TH Sarabun New" w:cs="TH Sarabun New"/>
           <w:sz w:val="48"/>
           <w:szCs w:val="48"/>
         </w:rPr>

</xml_diff>